<commit_message>
Security Scanner: IntelX free tier is 50/DAY (reset midnight UTC), not per-cycle
Pinned down the reset cadence via IntelX docs + /authenticate/info: 50 search
credits per DAY, reset at midnight UTC, max 3 concurrent. Re-framed the planning
note: the cohort's ~25-30 scans/day fits under 50/day with modest headroom, so
the free daily tier is borderline-viable for the steady cohort rate (not "10×
too small") — but no burst headroom + 3-concurrent throttle, so a paid
replacement is still recommended for safety/throughput, just not an emergency.

Co-Authored-By: Claude Opus 4.7 <noreply@anthropic.com>
</commit_message>
<xml_diff>
--- a/security_scanner/docs/OUTSTANDING.docx
+++ b/security_scanner/docs/OUTSTANDING.docx
@@ -1770,25 +1770,28 @@
     </w:p>
     <w:p>
       <w:r>
-        <w:t>note was stale). **Correction (2026-05-31, verified live via</w:t>
+        <w:t xml:space="preserve">note was stale). </w:t>
+      </w:r>
+      <w:r>
+        <w:rPr>
+          <w:b/>
+        </w:rPr>
+        <w:t>Verified 2026-05-31 via `/authenticate/info` + IntelX docs:</w:t>
       </w:r>
     </w:p>
     <w:p>
+      <w:r>
+        <w:t xml:space="preserve">the free tier's </w:t>
+      </w:r>
       <w:r>
         <w:rPr>
           <w:rFonts w:ascii="Consolas" w:hAnsi="Consolas"/>
           <w:sz w:val="18"/>
         </w:rPr>
-        <w:t>/authenticate/info</w:t>
+        <w:t>/intelligent/search</w:t>
       </w:r>
       <w:r>
-        <w:t>):</w:t>
-      </w:r>
-      <w:r>
-        <w:rPr>
-          <w:b/>
-        </w:rPr>
-        <w:t xml:space="preserve"> the free tier's search cap is </w:t>
+        <w:t xml:space="preserve"> cap is **</w:t>
       </w:r>
       <w:r>
         <w:rPr>
@@ -1798,68 +1801,12 @@
         <w:t>CreditMax = 50</w:t>
       </w:r>
       <w:r>
-        <w:t>** for</w:t>
+        <w:t xml:space="preserve"> per DAY, reset</w:t>
       </w:r>
     </w:p>
     <w:p>
       <w:r>
-        <w:rPr>
-          <w:rFonts w:ascii="Consolas" w:hAnsi="Consolas"/>
-          <w:sz w:val="18"/>
-        </w:rPr>
-        <w:t>/intelligent/search</w:t>
-      </w:r>
-      <w:r>
-        <w:t xml:space="preserve"> (NOT ~500 — that was a wrong code comment). </w:t>
-      </w:r>
-      <w:r>
-        <w:rPr>
-          <w:rFonts w:ascii="Consolas" w:hAnsi="Consolas"/>
-          <w:sz w:val="18"/>
-        </w:rPr>
-        <w:t>CreditReset</w:t>
-      </w:r>
-    </w:p>
-    <w:p>
-      <w:r>
-        <w:t xml:space="preserve">is present so credits </w:t>
-      </w:r>
-      <w:r>
-        <w:rPr>
-          <w:b/>
-        </w:rPr>
-        <w:t>do replenish</w:t>
-      </w:r>
-      <w:r>
-        <w:t xml:space="preserve"> (recurring, not one-off), but the cap is</w:t>
-      </w:r>
-    </w:p>
-    <w:p>
-      <w:r>
-        <w:t xml:space="preserve">only </w:t>
-      </w:r>
-      <w:r>
-        <w:rPr>
-          <w:b/>
-        </w:rPr>
-        <w:t>~50 search credits per cycle</w:t>
-      </w:r>
-      <w:r>
-        <w:t xml:space="preserve"> (1 credit/scan), and max 3 concurrent</w:t>
-      </w:r>
-    </w:p>
-    <w:p>
-      <w:r>
-        <w:t xml:space="preserve">searches. So it is usable only for a </w:t>
-      </w:r>
-      <w:r>
-        <w:rPr>
-          <w:b/>
-        </w:rPr>
-        <w:t>handful of ad-hoc scans per cycle</w:t>
-      </w:r>
-      <w:r>
-        <w:t xml:space="preserve"> —</w:t>
+        <w:t>at midnight UTC** (NOT ~500 — that was a wrong code comment), 1 credit/scan,</w:t>
       </w:r>
     </w:p>
     <w:p>
@@ -1867,20 +1814,65 @@
         <w:rPr>
           <w:b/>
         </w:rPr>
-        <w:t>far too small for the 4,000-client cohort or sustained broker volume.</w:t>
+        <w:t>max 3 concurrent searches</w:t>
       </w:r>
       <w:r>
-        <w:t xml:space="preserve"> A</w:t>
+        <w:t>.</w:t>
       </w:r>
     </w:p>
     <w:p>
       <w:r>
-        <w:t>sustainable paid replacement is therefore the real requirement. Avoid burning</w:t>
+        <w:t xml:space="preserve">Planning implication: the cohort runs at </w:t>
+      </w:r>
+      <w:r>
+        <w:rPr>
+          <w:b/>
+        </w:rPr>
+        <w:t>~25-30 scans/day</w:t>
+      </w:r>
+      <w:r>
+        <w:t xml:space="preserve"> (§3), which fits</w:t>
       </w:r>
     </w:p>
     <w:p>
       <w:r>
-        <w:t>credits on test scans (</w:t>
+        <w:rPr>
+          <w:i/>
+        </w:rPr>
+        <w:t>under</w:t>
+      </w:r>
+      <w:r>
+        <w:t xml:space="preserve"> 50/day with modest headroom — so the free daily tier is **borderline-</w:t>
+      </w:r>
+    </w:p>
+    <w:p>
+      <w:r>
+        <w:t>viable for the steady cohort rate**, NOT "10× too small" as first thought.</w:t>
+      </w:r>
+    </w:p>
+    <w:p>
+      <w:r>
+        <w:t>BUT: zero burst headroom, the 3-concurrent cap throttles throughput, and any</w:t>
+      </w:r>
+    </w:p>
+    <w:p>
+      <w:r>
+        <w:t>broker ad-hoc scans eat into the same 50. So a **paid replacement</w:t>
+      </w:r>
+    </w:p>
+    <w:p>
+      <w:r>
+        <w:t>(Snusbase / LeakCheck Pro / SpyCloud) is still recommended** for safety +</w:t>
+      </w:r>
+    </w:p>
+    <w:p>
+      <w:r>
+        <w:t>throughput + always-on use, but it is no longer an emergency blocker. Avoid</w:t>
+      </w:r>
+    </w:p>
+    <w:p>
+      <w:r>
+        <w:t>burning credits on test scans (</w:t>
       </w:r>
       <w:r>
         <w:rPr>
@@ -1890,7 +1882,12 @@
         <w:t>skip_intelx:true</w:t>
       </w:r>
       <w:r>
-        <w:t xml:space="preserve"> for smoke tests).</w:t>
+        <w:t>; the smoke test is already</w:t>
+      </w:r>
+    </w:p>
+    <w:p>
+      <w:r>
+        <w:t>credit-free).</w:t>
       </w:r>
     </w:p>
     <w:p>

</xml_diff>

<commit_message>
docs: log encrypted-export enhancements (5j recency clustering, 5k fresh dump refs)
From the phishield card back-test: the on-demand encrypted CSV carries no dates,
so clients can't reproduce the dashboard recency clustering (5j — add breach_date/
recency_band via per-source date join; encryption unaffected). And the freshest
exposure (30-90d = IntelX stealer-log postings, incl. a SA victim log) isn't in
the DeHashed export at all (5k — surface most-recent dump references, free listing
vs credit-gated content-fetch to distinguish History-visit from stolen passwords).

Co-Authored-By: Claude Opus 4.7 <noreply@anthropic.com>
</commit_message>
<xml_diff>
--- a/security_scanner/docs/OUTSTANDING.docx
+++ b/security_scanner/docs/OUTSTANDING.docx
@@ -3392,6 +3392,344 @@
           </w:p>
         </w:tc>
       </w:tr>
+      <w:tr>
+        <w:tc>
+          <w:tcPr>
+            <w:tcW w:type="dxa" w:w="3324"/>
+            <w:shd w:val="clear" w:color="auto" w:fill="F2F7FA"/>
+          </w:tcPr>
+          <w:p>
+            <w:r>
+              <w:rPr>
+                <w:sz w:val="19"/>
+              </w:rPr>
+            </w:r>
+            <w:r>
+              <w:rPr>
+                <w:sz w:val="19"/>
+              </w:rPr>
+              <w:t>5j</w:t>
+            </w:r>
+          </w:p>
+        </w:tc>
+        <w:tc>
+          <w:tcPr>
+            <w:tcW w:type="dxa" w:w="3324"/>
+            <w:shd w:val="clear" w:color="auto" w:fill="F2F7FA"/>
+          </w:tcPr>
+          <w:p>
+            <w:r>
+              <w:rPr>
+                <w:sz w:val="19"/>
+              </w:rPr>
+            </w:r>
+            <w:r>
+              <w:rPr>
+                <w:b/>
+                <w:sz w:val="19"/>
+              </w:rPr>
+              <w:t>Recency clustering INSIDE the encrypted export</w:t>
+            </w:r>
+          </w:p>
+        </w:tc>
+        <w:tc>
+          <w:tcPr>
+            <w:tcW w:type="dxa" w:w="3324"/>
+            <w:shd w:val="clear" w:color="auto" w:fill="F2F7FA"/>
+          </w:tcPr>
+          <w:p>
+            <w:r>
+              <w:rPr>
+                <w:sz w:val="19"/>
+              </w:rPr>
+            </w:r>
+            <w:r>
+              <w:rPr>
+                <w:sz w:val="19"/>
+              </w:rPr>
+              <w:t>Open. The on-demand encrypted CSV (</w:t>
+            </w:r>
+            <w:r>
+              <w:rPr>
+                <w:rFonts w:ascii="Consolas" w:hAnsi="Consolas"/>
+                <w:sz w:val="19"/>
+              </w:rPr>
+              <w:t>credential_export.py</w:t>
+            </w:r>
+            <w:r>
+              <w:rPr>
+                <w:sz w:val="19"/>
+              </w:rPr>
+              <w:t xml:space="preserve">, Manual §6.4) currently has no dates — only </w:t>
+            </w:r>
+            <w:r>
+              <w:rPr>
+                <w:rFonts w:ascii="Consolas" w:hAnsi="Consolas"/>
+                <w:sz w:val="19"/>
+              </w:rPr>
+              <w:t>email,username,password,hashed_password,database</w:t>
+            </w:r>
+            <w:r>
+              <w:rPr>
+                <w:sz w:val="19"/>
+              </w:rPr>
+              <w:t xml:space="preserve"> — so the client cannot reproduce the dashboard's recency-band "clustering" from the file. Fix: add </w:t>
+            </w:r>
+            <w:r>
+              <w:rPr>
+                <w:rFonts w:ascii="Consolas" w:hAnsi="Consolas"/>
+                <w:sz w:val="19"/>
+              </w:rPr>
+              <w:t>breach_date</w:t>
+            </w:r>
+            <w:r>
+              <w:rPr>
+                <w:sz w:val="19"/>
+              </w:rPr>
+              <w:t xml:space="preserve"> + </w:t>
+            </w:r>
+            <w:r>
+              <w:rPr>
+                <w:rFonts w:ascii="Consolas" w:hAnsi="Consolas"/>
+                <w:sz w:val="19"/>
+              </w:rPr>
+              <w:t>recency_band</w:t>
+            </w:r>
+            <w:r>
+              <w:rPr>
+                <w:sz w:val="19"/>
+              </w:rPr>
+              <w:t xml:space="preserve"> columns by joining each record's </w:t>
+            </w:r>
+            <w:r>
+              <w:rPr>
+                <w:rFonts w:ascii="Consolas" w:hAnsi="Consolas"/>
+                <w:sz w:val="19"/>
+              </w:rPr>
+              <w:t>database</w:t>
+            </w:r>
+            <w:r>
+              <w:rPr>
+                <w:sz w:val="19"/>
+              </w:rPr>
+              <w:t xml:space="preserve"> to the same per-source date-guesstimate the correlation card already uses (enriched_sources breach_date + </w:t>
+            </w:r>
+            <w:r>
+              <w:rPr>
+                <w:rFonts w:ascii="Consolas" w:hAnsi="Consolas"/>
+                <w:sz w:val="19"/>
+              </w:rPr>
+              <w:t>KNOWN_BREACH_DATES</w:t>
+            </w:r>
+            <w:r>
+              <w:rPr>
+                <w:sz w:val="19"/>
+              </w:rPr>
+              <w:t xml:space="preserve">). </w:t>
+            </w:r>
+            <w:r>
+              <w:rPr>
+                <w:b/>
+                <w:sz w:val="19"/>
+              </w:rPr>
+              <w:t>Encryption is unaffected</w:t>
+            </w:r>
+            <w:r>
+              <w:rPr>
+                <w:sz w:val="19"/>
+              </w:rPr>
+              <w:t xml:space="preserve"> — we encrypt whatever bytes we build, so enriching columns is orthogonal to age/AES. </w:t>
+            </w:r>
+            <w:r>
+              <w:rPr>
+                <w:b/>
+                <w:sz w:val="19"/>
+              </w:rPr>
+              <w:t>Honest limitation:</w:t>
+            </w:r>
+            <w:r>
+              <w:rPr>
+                <w:sz w:val="19"/>
+              </w:rPr>
+              <w:t xml:space="preserve"> DeHashed records carry no reliable per-credential date, so the band is per-SOURCE, not per-record (same caveat the recency timeline already has). The export re-queries DeHashed live and doesn't load the scan, so it must re-derive source dates at export time (or be passed the scan's </w:t>
+            </w:r>
+            <w:r>
+              <w:rPr>
+                <w:rFonts w:ascii="Consolas" w:hAnsi="Consolas"/>
+                <w:sz w:val="19"/>
+              </w:rPr>
+              <w:t>dehashed.enriched_sources</w:t>
+            </w:r>
+            <w:r>
+              <w:rPr>
+                <w:sz w:val="19"/>
+              </w:rPr>
+              <w:t>).</w:t>
+            </w:r>
+          </w:p>
+        </w:tc>
+      </w:tr>
+      <w:tr>
+        <w:tc>
+          <w:tcPr>
+            <w:tcW w:type="dxa" w:w="3324"/>
+          </w:tcPr>
+          <w:p>
+            <w:r>
+              <w:rPr>
+                <w:sz w:val="19"/>
+              </w:rPr>
+            </w:r>
+            <w:r>
+              <w:rPr>
+                <w:sz w:val="19"/>
+              </w:rPr>
+              <w:t>5k</w:t>
+            </w:r>
+          </w:p>
+        </w:tc>
+        <w:tc>
+          <w:tcPr>
+            <w:tcW w:type="dxa" w:w="3324"/>
+          </w:tcPr>
+          <w:p>
+            <w:r>
+              <w:rPr>
+                <w:sz w:val="19"/>
+              </w:rPr>
+            </w:r>
+            <w:r>
+              <w:rPr>
+                <w:b/>
+                <w:sz w:val="19"/>
+              </w:rPr>
+              <w:t>Fresh IntelX / Hudson-Rock dump references — "most recent leaks/circulations" view (on client request)</w:t>
+            </w:r>
+          </w:p>
+        </w:tc>
+        <w:tc>
+          <w:tcPr>
+            <w:tcW w:type="dxa" w:w="3324"/>
+          </w:tcPr>
+          <w:p>
+            <w:r>
+              <w:rPr>
+                <w:sz w:val="19"/>
+              </w:rPr>
+            </w:r>
+            <w:r>
+              <w:rPr>
+                <w:sz w:val="19"/>
+              </w:rPr>
+              <w:t xml:space="preserve">Open. The genuinely-fresh exposure (e.g. phishield's 30-90d band = 4 IntelX stealer-log postings, Mar-Apr 2026, incl. a SA-tagged victim log </w:t>
+            </w:r>
+            <w:r>
+              <w:rPr>
+                <w:rFonts w:ascii="Consolas" w:hAnsi="Consolas"/>
+                <w:sz w:val="19"/>
+              </w:rPr>
+              <w:t>48438_ZA_169.0.21.31</w:t>
+            </w:r>
+            <w:r>
+              <w:rPr>
+                <w:sz w:val="19"/>
+              </w:rPr>
+              <w:t xml:space="preserve"> infected 2026-02-21) lives in the </w:t>
+            </w:r>
+            <w:r>
+              <w:rPr>
+                <w:b/>
+                <w:sz w:val="19"/>
+              </w:rPr>
+              <w:t>IntelX channel and is NOT in the DeHashed export</w:t>
+            </w:r>
+            <w:r>
+              <w:rPr>
+                <w:sz w:val="19"/>
+              </w:rPr>
+              <w:t xml:space="preserve">. Goal: surface a date-ordered list of the most recent dump references so the client can act. Two tiers: (a) </w:t>
+            </w:r>
+            <w:r>
+              <w:rPr>
+                <w:b/>
+                <w:sz w:val="19"/>
+              </w:rPr>
+              <w:t>listing-only (free)</w:t>
+            </w:r>
+            <w:r>
+              <w:rPr>
+                <w:sz w:val="19"/>
+              </w:rPr>
+              <w:t xml:space="preserve"> — name/date/media/type we already capture in </w:t>
+            </w:r>
+            <w:r>
+              <w:rPr>
+                <w:rFonts w:ascii="Consolas" w:hAnsi="Consolas"/>
+                <w:sz w:val="19"/>
+              </w:rPr>
+              <w:t>intelx.recent_results</w:t>
+            </w:r>
+            <w:r>
+              <w:rPr>
+                <w:sz w:val="19"/>
+              </w:rPr>
+              <w:t xml:space="preserve">; (b) </w:t>
+            </w:r>
+            <w:r>
+              <w:rPr>
+                <w:b/>
+                <w:sz w:val="19"/>
+              </w:rPr>
+              <w:t>content-fetch (costs IntelX credits, on explicit request)</w:t>
+            </w:r>
+            <w:r>
+              <w:rPr>
+                <w:sz w:val="19"/>
+              </w:rPr>
+              <w:t xml:space="preserve"> — pull the dump body to confirm match TYPE, since </w:t>
+            </w:r>
+            <w:r>
+              <w:rPr>
+                <w:rFonts w:ascii="Consolas" w:hAnsi="Consolas"/>
+                <w:sz w:val="19"/>
+              </w:rPr>
+              <w:t>History/</w:t>
+            </w:r>
+            <w:r>
+              <w:rPr>
+                <w:sz w:val="19"/>
+              </w:rPr>
+              <w:t xml:space="preserve"> = site merely visited whereas </w:t>
+            </w:r>
+            <w:r>
+              <w:rPr>
+                <w:rFonts w:ascii="Consolas" w:hAnsi="Consolas"/>
+                <w:sz w:val="19"/>
+              </w:rPr>
+              <w:t>Passwords/</w:t>
+            </w:r>
+            <w:r>
+              <w:rPr>
+                <w:sz w:val="19"/>
+              </w:rPr>
+              <w:t>+</w:t>
+            </w:r>
+            <w:r>
+              <w:rPr>
+                <w:rFonts w:ascii="Consolas" w:hAnsi="Consolas"/>
+                <w:sz w:val="19"/>
+              </w:rPr>
+              <w:t>Autofill/</w:t>
+            </w:r>
+            <w:r>
+              <w:rPr>
+                <w:sz w:val="19"/>
+              </w:rPr>
+              <w:t xml:space="preserve"> = credential actually stolen (the free listing can't distinguish). Include these references in the encrypted export and/or report appendix. Pairs with [5j].</w:t>
+            </w:r>
+          </w:p>
+        </w:tc>
+      </w:tr>
     </w:tbl>
     <w:p/>
     <w:p>

</xml_diff>

<commit_message>
docs: 5j done + 5k partial; log 5L (confidence-gate the p(breach) input)
5j (recency clustering in export) shipped in 360c34f — remove. 5k narrowed to the
remaining credit-gated content-fetch tier. New 5L captures the rabbit-hole
end-state: whether to gate p(breach)/RSI uplift on match-type confidence so a
low-confidence freshness signal can't inflate the probability — calibration-gated
scoring decision; cat model unaffected.

Co-Authored-By: Claude Opus 4.7 <noreply@anthropic.com>
</commit_message>
<xml_diff>
--- a/security_scanner/docs/OUTSTANDING.docx
+++ b/security_scanner/docs/OUTSTANDING.docx
@@ -3408,7 +3408,7 @@
               <w:rPr>
                 <w:sz w:val="19"/>
               </w:rPr>
-              <w:t>5j</w:t>
+              <w:t>5k</w:t>
             </w:r>
           </w:p>
         </w:tc>
@@ -3428,7 +3428,7 @@
                 <w:b/>
                 <w:sz w:val="19"/>
               </w:rPr>
-              <w:t>Recency clustering INSIDE the encrypted export</w:t>
+              <w:t>Fresh-dump content-fetch (credit-gated tier)</w:t>
             </w:r>
           </w:p>
         </w:tc>
@@ -3445,126 +3445,107 @@
             </w:r>
             <w:r>
               <w:rPr>
-                <w:sz w:val="19"/>
-              </w:rPr>
-              <w:t>Open. The on-demand encrypted CSV (</w:t>
+                <w:b/>
+                <w:sz w:val="19"/>
+              </w:rPr>
+              <w:t>Partial — done 2026-06-02:</w:t>
+            </w:r>
+            <w:r>
+              <w:rPr>
+                <w:sz w:val="19"/>
+              </w:rPr>
+              <w:t xml:space="preserve"> the encrypted export now includes IntelX stealer-log postings as date-ordered </w:t>
             </w:r>
             <w:r>
               <w:rPr>
                 <w:rFonts w:ascii="Consolas" w:hAnsi="Consolas"/>
                 <w:sz w:val="19"/>
               </w:rPr>
+              <w:t>leak_reference</w:t>
+            </w:r>
+            <w:r>
+              <w:rPr>
+                <w:sz w:val="19"/>
+              </w:rPr>
+              <w:t xml:space="preserve"> rows with a </w:t>
+            </w:r>
+            <w:r>
+              <w:rPr>
+                <w:rFonts w:ascii="Consolas" w:hAnsi="Consolas"/>
+                <w:sz w:val="19"/>
+              </w:rPr>
+              <w:t>match_type</w:t>
+            </w:r>
+            <w:r>
+              <w:rPr>
+                <w:sz w:val="19"/>
+              </w:rPr>
+              <w:t>→</w:t>
+            </w:r>
+            <w:r>
+              <w:rPr>
+                <w:rFonts w:ascii="Consolas" w:hAnsi="Consolas"/>
+                <w:sz w:val="19"/>
+              </w:rPr>
+              <w:t>confidence</w:t>
+            </w:r>
+            <w:r>
+              <w:rPr>
+                <w:sz w:val="19"/>
+              </w:rPr>
+              <w:t xml:space="preserve"> label (</w:t>
+            </w:r>
+            <w:r>
+              <w:rPr>
+                <w:rFonts w:ascii="Consolas" w:hAnsi="Consolas"/>
+                <w:sz w:val="19"/>
+              </w:rPr>
               <w:t>credential_export.py</w:t>
             </w:r>
             <w:r>
               <w:rPr>
                 <w:sz w:val="19"/>
               </w:rPr>
-              <w:t xml:space="preserve">, Manual §6.4) currently has no dates — only </w:t>
+              <w:t xml:space="preserve">; Manual §6.4). </w:t>
+            </w:r>
+            <w:r>
+              <w:rPr>
+                <w:b/>
+                <w:sz w:val="19"/>
+              </w:rPr>
+              <w:t>Still open:</w:t>
+            </w:r>
+            <w:r>
+              <w:rPr>
+                <w:sz w:val="19"/>
+              </w:rPr>
+              <w:t xml:space="preserve"> the </w:t>
+            </w:r>
+            <w:r>
+              <w:rPr>
+                <w:b/>
+                <w:sz w:val="19"/>
+              </w:rPr>
+              <w:t>content-fetch tier</w:t>
+            </w:r>
+            <w:r>
+              <w:rPr>
+                <w:sz w:val="19"/>
+              </w:rPr>
+              <w:t xml:space="preserve"> — on explicit client request, pull the named dump BODY (IntelX selector/view, costs credits) to confirm whether a real credential was exposed vs just a </w:t>
             </w:r>
             <w:r>
               <w:rPr>
                 <w:rFonts w:ascii="Consolas" w:hAnsi="Consolas"/>
                 <w:sz w:val="19"/>
               </w:rPr>
-              <w:t>email,username,password,hashed_password,database</w:t>
-            </w:r>
-            <w:r>
-              <w:rPr>
-                <w:sz w:val="19"/>
-              </w:rPr>
-              <w:t xml:space="preserve"> — so the client cannot reproduce the dashboard's recency-band "clustering" from the file. Fix: add </w:t>
-            </w:r>
-            <w:r>
-              <w:rPr>
-                <w:rFonts w:ascii="Consolas" w:hAnsi="Consolas"/>
-                <w:sz w:val="19"/>
-              </w:rPr>
-              <w:t>breach_date</w:t>
-            </w:r>
-            <w:r>
-              <w:rPr>
-                <w:sz w:val="19"/>
-              </w:rPr>
-              <w:t xml:space="preserve"> + </w:t>
-            </w:r>
-            <w:r>
-              <w:rPr>
-                <w:rFonts w:ascii="Consolas" w:hAnsi="Consolas"/>
-                <w:sz w:val="19"/>
-              </w:rPr>
-              <w:t>recency_band</w:t>
-            </w:r>
-            <w:r>
-              <w:rPr>
-                <w:sz w:val="19"/>
-              </w:rPr>
-              <w:t xml:space="preserve"> columns by joining each record's </w:t>
-            </w:r>
-            <w:r>
-              <w:rPr>
-                <w:rFonts w:ascii="Consolas" w:hAnsi="Consolas"/>
-                <w:sz w:val="19"/>
-              </w:rPr>
-              <w:t>database</w:t>
-            </w:r>
-            <w:r>
-              <w:rPr>
-                <w:sz w:val="19"/>
-              </w:rPr>
-              <w:t xml:space="preserve"> to the same per-source date-guesstimate the correlation card already uses (enriched_sources breach_date + </w:t>
-            </w:r>
-            <w:r>
-              <w:rPr>
-                <w:rFonts w:ascii="Consolas" w:hAnsi="Consolas"/>
-                <w:sz w:val="19"/>
-              </w:rPr>
-              <w:t>KNOWN_BREACH_DATES</w:t>
-            </w:r>
-            <w:r>
-              <w:rPr>
-                <w:sz w:val="19"/>
-              </w:rPr>
-              <w:t xml:space="preserve">). </w:t>
-            </w:r>
-            <w:r>
-              <w:rPr>
-                <w:b/>
-                <w:sz w:val="19"/>
-              </w:rPr>
-              <w:t>Encryption is unaffected</w:t>
-            </w:r>
-            <w:r>
-              <w:rPr>
-                <w:sz w:val="19"/>
-              </w:rPr>
-              <w:t xml:space="preserve"> — we encrypt whatever bytes we build, so enriching columns is orthogonal to age/AES. </w:t>
-            </w:r>
-            <w:r>
-              <w:rPr>
-                <w:b/>
-                <w:sz w:val="19"/>
-              </w:rPr>
-              <w:t>Honest limitation:</w:t>
-            </w:r>
-            <w:r>
-              <w:rPr>
-                <w:sz w:val="19"/>
-              </w:rPr>
-              <w:t xml:space="preserve"> DeHashed records carry no reliable per-credential date, so the band is per-SOURCE, not per-record (same caveat the recency timeline already has). The export re-queries DeHashed live and doesn't load the scan, so it must re-derive source dates at export time (or be passed the scan's </w:t>
-            </w:r>
-            <w:r>
-              <w:rPr>
-                <w:rFonts w:ascii="Consolas" w:hAnsi="Consolas"/>
-                <w:sz w:val="19"/>
-              </w:rPr>
-              <w:t>dehashed.enriched_sources</w:t>
-            </w:r>
-            <w:r>
-              <w:rPr>
-                <w:sz w:val="19"/>
-              </w:rPr>
-              <w:t>).</w:t>
+              <w:t>History/</w:t>
+            </w:r>
+            <w:r>
+              <w:rPr>
+                <w:sz w:val="19"/>
+              </w:rPr>
+              <w:t xml:space="preserve"> visit. The free listing classifies by path but cannot read the contents.</w:t>
             </w:r>
           </w:p>
         </w:tc>
@@ -3584,7 +3565,7 @@
               <w:rPr>
                 <w:sz w:val="19"/>
               </w:rPr>
-              <w:t>5k</w:t>
+              <w:t>5L</w:t>
             </w:r>
           </w:p>
         </w:tc>
@@ -3603,7 +3584,7 @@
                 <w:b/>
                 <w:sz w:val="19"/>
               </w:rPr>
-              <w:t>Fresh IntelX / Hudson-Rock dump references — "most recent leaks/circulations" view (on client request)</w:t>
+              <w:t>Confidence-gate the p(breach) / RSI input (scoring decision — NOT done)</w:t>
             </w:r>
           </w:p>
         </w:tc>
@@ -3621,111 +3602,72 @@
               <w:rPr>
                 <w:sz w:val="19"/>
               </w:rPr>
-              <w:t xml:space="preserve">Open. The genuinely-fresh exposure (e.g. phishield's 30-90d band = 4 IntelX stealer-log postings, Mar-Apr 2026, incl. a SA-tagged victim log </w:t>
+              <w:t xml:space="preserve">Open, </w:t>
+            </w:r>
+            <w:r>
+              <w:rPr>
+                <w:b/>
+                <w:sz w:val="19"/>
+              </w:rPr>
+              <w:t>calibration-gated</w:t>
+            </w:r>
+            <w:r>
+              <w:rPr>
+                <w:sz w:val="19"/>
+              </w:rPr>
+              <w:t xml:space="preserve"> (scoring-change rule). The export/dashboard now expose a </w:t>
             </w:r>
             <w:r>
               <w:rPr>
                 <w:rFonts w:ascii="Consolas" w:hAnsi="Consolas"/>
                 <w:sz w:val="19"/>
               </w:rPr>
-              <w:t>48438_ZA_169.0.21.31</w:t>
-            </w:r>
-            <w:r>
-              <w:rPr>
-                <w:sz w:val="19"/>
-              </w:rPr>
-              <w:t xml:space="preserve"> infected 2026-02-21) lives in the </w:t>
+              <w:t>match_type</w:t>
+            </w:r>
+            <w:r>
+              <w:rPr>
+                <w:sz w:val="19"/>
+              </w:rPr>
+              <w:t>→</w:t>
+            </w:r>
+            <w:r>
+              <w:rPr>
+                <w:rFonts w:ascii="Consolas" w:hAnsi="Consolas"/>
+                <w:sz w:val="19"/>
+              </w:rPr>
+              <w:t>confidence</w:t>
+            </w:r>
+            <w:r>
+              <w:rPr>
+                <w:sz w:val="19"/>
+              </w:rPr>
+              <w:t xml:space="preserve"> model, but the </w:t>
+            </w:r>
+            <w:r>
+              <w:rPr>
+                <w:i/>
+                <w:sz w:val="19"/>
+              </w:rPr>
+              <w:t>score</w:t>
+            </w:r>
+            <w:r>
+              <w:rPr>
+                <w:sz w:val="19"/>
+              </w:rPr>
+              <w:t xml:space="preserve"> does not yet use it: a recent LOW-confidence reference (aggregated index, browser-History visit) can still pull credential signals the same as a HIGH-confidence password capture. Decision to make: gate any p(breach)/RSI uplift on HIGH-confidence (or content-fetch-confirmed) evidence, so low-confidence freshness alone does not inflate the probability. Builds on the §6 "Credential-risk scoring calibration" ticket. </w:t>
             </w:r>
             <w:r>
               <w:rPr>
                 <w:b/>
                 <w:sz w:val="19"/>
               </w:rPr>
-              <w:t>IntelX channel and is NOT in the DeHashed export</w:t>
-            </w:r>
-            <w:r>
-              <w:rPr>
-                <w:sz w:val="19"/>
-              </w:rPr>
-              <w:t xml:space="preserve">. Goal: surface a date-ordered list of the most recent dump references so the client can act. Two tiers: (a) </w:t>
-            </w:r>
-            <w:r>
-              <w:rPr>
-                <w:b/>
-                <w:sz w:val="19"/>
-              </w:rPr>
-              <w:t>listing-only (free)</w:t>
-            </w:r>
-            <w:r>
-              <w:rPr>
-                <w:sz w:val="19"/>
-              </w:rPr>
-              <w:t xml:space="preserve"> — name/date/media/type we already capture in </w:t>
-            </w:r>
-            <w:r>
-              <w:rPr>
-                <w:rFonts w:ascii="Consolas" w:hAnsi="Consolas"/>
-                <w:sz w:val="19"/>
-              </w:rPr>
-              <w:t>intelx.recent_results</w:t>
-            </w:r>
-            <w:r>
-              <w:rPr>
-                <w:sz w:val="19"/>
-              </w:rPr>
-              <w:t xml:space="preserve">; (b) </w:t>
-            </w:r>
-            <w:r>
-              <w:rPr>
-                <w:b/>
-                <w:sz w:val="19"/>
-              </w:rPr>
-              <w:t>content-fetch (costs IntelX credits, on explicit request)</w:t>
-            </w:r>
-            <w:r>
-              <w:rPr>
-                <w:sz w:val="19"/>
-              </w:rPr>
-              <w:t xml:space="preserve"> — pull the dump body to confirm match TYPE, since </w:t>
-            </w:r>
-            <w:r>
-              <w:rPr>
-                <w:rFonts w:ascii="Consolas" w:hAnsi="Consolas"/>
-                <w:sz w:val="19"/>
-              </w:rPr>
-              <w:t>History/</w:t>
-            </w:r>
-            <w:r>
-              <w:rPr>
-                <w:sz w:val="19"/>
-              </w:rPr>
-              <w:t xml:space="preserve"> = site merely visited whereas </w:t>
-            </w:r>
-            <w:r>
-              <w:rPr>
-                <w:rFonts w:ascii="Consolas" w:hAnsi="Consolas"/>
-                <w:sz w:val="19"/>
-              </w:rPr>
-              <w:t>Passwords/</w:t>
-            </w:r>
-            <w:r>
-              <w:rPr>
-                <w:sz w:val="19"/>
-              </w:rPr>
-              <w:t>+</w:t>
-            </w:r>
-            <w:r>
-              <w:rPr>
-                <w:rFonts w:ascii="Consolas" w:hAnsi="Consolas"/>
-                <w:sz w:val="19"/>
-              </w:rPr>
-              <w:t>Autofill/</w:t>
-            </w:r>
-            <w:r>
-              <w:rPr>
-                <w:sz w:val="19"/>
-              </w:rPr>
-              <w:t xml:space="preserve"> = credential actually stolen (the free listing can't distinguish). Include these references in the encrypted export and/or report appendix. Pairs with [5j].</w:t>
+              <w:t>Cat model is unaffected — this is purely the p(breach) input.</w:t>
+            </w:r>
+            <w:r>
+              <w:rPr>
+                <w:sz w:val="19"/>
+              </w:rPr>
+              <w:t xml:space="preserve"> Until decided, the disclaimer + content-fetch prompt (5k) is the interim control.</w:t>
             </w:r>
           </w:p>
         </w:tc>

</xml_diff>

<commit_message>
docs: flag export enrichment depends on persistent DB (ephemeral Render wipes it on deploy)
Live verification of 5j/5k found the export's date/leak-ref enrichment came back
empty because Render's free-tier disk wiped scans.db on the deploy — the endpoint
gracefully degraded (correct), but a scan->deploy->export sequence silently drops
the clustering. Tied to the existing Cloud SQL Postgres migration item.

Co-Authored-By: Claude Opus 4.7 <noreply@anthropic.com>
</commit_message>
<xml_diff>
--- a/security_scanner/docs/OUTSTANDING.docx
+++ b/security_scanner/docs/OUTSTANDING.docx
@@ -568,7 +568,33 @@
               <w:rPr>
                 <w:sz w:val="19"/>
               </w:rPr>
-              <w:t xml:space="preserve"> from SQLite-on-Render to Cloud SQL Postgres.</w:t>
+              <w:t xml:space="preserve"> from SQLite-on-Render to Cloud SQL Postgres. </w:t>
+            </w:r>
+            <w:r>
+              <w:rPr>
+                <w:b/>
+                <w:sz w:val="19"/>
+              </w:rPr>
+              <w:t>Now also load-bearing for the encrypted-export enrichment (5j/5k):</w:t>
+            </w:r>
+            <w:r>
+              <w:rPr>
+                <w:sz w:val="19"/>
+              </w:rPr>
+              <w:t xml:space="preserve"> the export pulls recency dates + IntelX leak-refs from the domain's last scan, but Render's free-tier disk is </w:t>
+            </w:r>
+            <w:r>
+              <w:rPr>
+                <w:b/>
+                <w:sz w:val="19"/>
+              </w:rPr>
+              <w:t>ephemeral and wipes `scans.db` on every deploy</w:t>
+            </w:r>
+            <w:r>
+              <w:rPr>
+                <w:sz w:val="19"/>
+              </w:rPr>
+              <w:t xml:space="preserve"> — so a scan→deploy→export sequence silently drops the dates/leak-refs (export still returns credentials, just un-clustered). Persistent DB removes this. Interim: re-scan before exporting if a deploy has occurred.</w:t>
             </w:r>
           </w:p>
         </w:tc>

</xml_diff>

<commit_message>
docs: FIN-9 pre-read — confidence-weighted credential contribution to p(breach)
Calibration pre-read for 2026-06-03: documents the asymmetry (RSI already uses the
confidence-aware credential_risk verdict; p(breach) still uses raw dehashed count),
the proposed model (classify at scan time, no PII; collapse to a None->Critical
confidence class; replace the raw count in p_breach), the K1-K7 calibration knobs,
and the empirical anchors (DBIR/Mandiant/IBM CoDB/Sophos SA) that should set each.
Calibration-gated scoring change; cat model unaffected. Linked from OUTSTANDING 5L.

Co-Authored-By: Claude Opus 4.7 <noreply@anthropic.com>
</commit_message>
<xml_diff>
--- a/security_scanner/docs/OUTSTANDING.docx
+++ b/security_scanner/docs/OUTSTANDING.docx
@@ -3693,7 +3693,20 @@
               <w:rPr>
                 <w:sz w:val="19"/>
               </w:rPr>
-              <w:t xml:space="preserve"> Until decided, the disclaimer + content-fetch prompt (5k) is the interim control.</w:t>
+              <w:t xml:space="preserve"> Until decided, the disclaimer + content-fetch prompt (5k) is the interim control. </w:t>
+            </w:r>
+            <w:r>
+              <w:rPr>
+                <w:b/>
+                <w:sz w:val="19"/>
+              </w:rPr>
+              <w:t>Design pre-read for the 2026-06-03 FIN-9 calibration session: `docs/credential_confidence_pbreach_design.md`</w:t>
+            </w:r>
+            <w:r>
+              <w:rPr>
+                <w:sz w:val="19"/>
+              </w:rPr>
+              <w:t xml:space="preserve"> (current wiring, the model, the K1-K7 calibration knobs, and the empirical anchors that set them).</w:t>
             </w:r>
           </w:p>
         </w:tc>

</xml_diff>

<commit_message>
docs: FIN-9 calibration inputs — financial-loss impact of the accuracy waves (§6b)
Wave 1 wired _overall_score into the FIC for the first time (vulnerability now
couples to posture, was pinned 0.5); the de-inflation waves dropped scores
(phishield 381->169 on a fixed-code scan). So FIN-9's Pareto calibration + the
5L credential-confidence work must anchor to the corrected post-fix baseline,
not the old inflated one. Adds a parameter-calibration table (vulnerability<-score
curve + the 0.3, credential contribution, Pareto alpha/mixture, Wave-4 remediation
cap constants, TEF, HIBP step thresholds, COST_PER_RECORD/REGULATORY_FINE, K_TAIL)
and a pre-session action to regenerate reference loss curves on the fixed code.

Co-Authored-By: Claude Opus 4.7 <noreply@anthropic.com>
</commit_message>
<xml_diff>
--- a/security_scanner/docs/OUTSTANDING.docx
+++ b/security_scanner/docs/OUTSTANDING.docx
@@ -4390,6 +4390,951 @@
           <w:color w:val="0F2744"/>
           <w:sz w:val="28"/>
         </w:rPr>
+        <w:t>6b. FIN-9 calibration inputs — financial-loss impact of the 2026-06-03 accuracy waves</w:t>
+      </w:r>
+    </w:p>
+    <w:p>
+      <w:r>
+        <w:rPr>
+          <w:b/>
+        </w:rPr>
+        <w:t>Why this matters for the FIN-9 session.</w:t>
+      </w:r>
+      <w:r>
+        <w:t xml:space="preserve"> Wave 1 wired </w:t>
+      </w:r>
+      <w:r>
+        <w:rPr>
+          <w:rFonts w:ascii="Consolas" w:hAnsi="Consolas"/>
+          <w:sz w:val="18"/>
+        </w:rPr>
+        <w:t>cat_results["_overall_score"]</w:t>
+      </w:r>
+    </w:p>
+    <w:p>
+      <w:r>
+        <w:t xml:space="preserve">into the FinancialImpactCalculator for the FIRST time in production — </w:t>
+      </w:r>
+      <w:r>
+        <w:rPr>
+          <w:rFonts w:ascii="Consolas" w:hAnsi="Consolas"/>
+          <w:sz w:val="18"/>
+        </w:rPr>
+        <w:t>vulnerability</w:t>
+      </w:r>
+    </w:p>
+    <w:p>
+      <w:r>
+        <w:t>now couples to the real posture score (was permanently pinned at 0.5). Combined with</w:t>
+      </w:r>
+    </w:p>
+    <w:p>
+      <w:r>
+        <w:t>the de-inflation from the other waves (SSL no longer auto-"Invalid" −40, DNSBL no longer</w:t>
+      </w:r>
+    </w:p>
+    <w:p>
+      <w:r>
+        <w:t>auto-"blacklisted", Exposed-Admin 403-inversion gone, phantom F5-WAF and fabricated</w:t>
+      </w:r>
+    </w:p>
+    <w:p>
+      <w:r>
+        <w:t>CVE ASN/geo removed, HTTP-headers no longer false-penalised off a 403 block page), the</w:t>
+      </w:r>
+    </w:p>
+    <w:p>
+      <w:r>
+        <w:t xml:space="preserve">financial-loss </w:t>
+      </w:r>
+      <w:r>
+        <w:rPr>
+          <w:b/>
+        </w:rPr>
+        <w:t>inputs changed materially</w:t>
+      </w:r>
+      <w:r>
+        <w:t>. Worked example: a fixed-code production</w:t>
+      </w:r>
+    </w:p>
+    <w:p>
+      <w:r>
+        <w:t xml:space="preserve">scan of phishield.com now scores </w:t>
+      </w:r>
+      <w:r>
+        <w:rPr>
+          <w:b/>
+        </w:rPr>
+        <w:t>169 (Low)</w:t>
+      </w:r>
+      <w:r>
+        <w:t xml:space="preserve"> vs </w:t>
+      </w:r>
+      <w:r>
+        <w:rPr>
+          <w:b/>
+        </w:rPr>
+        <w:t>381 (Medium)</w:t>
+      </w:r>
+      <w:r>
+        <w:t xml:space="preserve"> pre-fix, so its</w:t>
+      </w:r>
+    </w:p>
+    <w:p>
+      <w:r>
+        <w:rPr>
+          <w:rFonts w:ascii="Consolas" w:hAnsi="Consolas"/>
+          <w:sz w:val="18"/>
+        </w:rPr>
+        <w:t>p_breach</w:t>
+      </w:r>
+      <w:r>
+        <w:t>, expected loss and every Monte-Carlo return-period tail shift accordingly.</w:t>
+      </w:r>
+    </w:p>
+    <w:p>
+      <w:r>
+        <w:rPr>
+          <w:b/>
+        </w:rPr>
+        <w:t>Consequence:</w:t>
+      </w:r>
+      <w:r>
+        <w:t xml:space="preserve"> the FIN-9 Pareto widening (and the 5L credential-confidence work) must</w:t>
+      </w:r>
+    </w:p>
+    <w:p>
+      <w:r>
+        <w:t xml:space="preserve">anchor to the </w:t>
+      </w:r>
+      <w:r>
+        <w:rPr>
+          <w:b/>
+        </w:rPr>
+        <w:t>corrected post-fix loss baseline</w:t>
+      </w:r>
+      <w:r>
+        <w:t>, not the old inflated one. The</w:t>
+      </w:r>
+    </w:p>
+    <w:p>
+      <w:r>
+        <w:t xml:space="preserve">downstream financial constants below were never empirically validated against </w:t>
+      </w:r>
+      <w:r>
+        <w:rPr>
+          <w:i/>
+        </w:rPr>
+        <w:t>working</w:t>
+      </w:r>
+    </w:p>
+    <w:p>
+      <w:r>
+        <w:t>coupling (the coupling was broken until Wave 1), so they now genuinely need calibration.</w:t>
+      </w:r>
+    </w:p>
+    <w:p>
+      <w:r>
+        <w:rPr>
+          <w:b/>
+        </w:rPr>
+        <w:t>Parameters to calibrate (anchor to DBIR / Mandiant M-Trends / IBM CoDB / Sophos SA + colleague judgement):</w:t>
+      </w:r>
+    </w:p>
+    <w:tbl>
+      <w:tblPr>
+        <w:tblW w:type="auto" w:w="0"/>
+        <w:jc w:val="center"/>
+        <w:tblLayout w:type="autofit"/>
+        <w:tblLook w:firstColumn="1" w:firstRow="1" w:lastColumn="0" w:lastRow="0" w:noHBand="0" w:noVBand="1" w:val="04A0"/>
+      </w:tblPr>
+      <w:tblGrid>
+        <w:gridCol w:w="3324"/>
+        <w:gridCol w:w="3324"/>
+        <w:gridCol w:w="3324"/>
+      </w:tblGrid>
+      <w:tr>
+        <w:tc>
+          <w:tcPr>
+            <w:tcW w:type="dxa" w:w="3324"/>
+            <w:shd w:val="clear" w:color="auto" w:fill="0F2744"/>
+          </w:tcPr>
+          <w:p>
+            <w:r>
+              <w:rPr>
+                <w:b/>
+                <w:color w:val="FFFFFF"/>
+                <w:sz w:val="19"/>
+              </w:rPr>
+            </w:r>
+            <w:r>
+              <w:rPr>
+                <w:b/>
+                <w:color w:val="FFFFFF"/>
+                <w:sz w:val="19"/>
+              </w:rPr>
+              <w:t>Parameter</w:t>
+            </w:r>
+          </w:p>
+        </w:tc>
+        <w:tc>
+          <w:tcPr>
+            <w:tcW w:type="dxa" w:w="3324"/>
+            <w:shd w:val="clear" w:color="auto" w:fill="0F2744"/>
+          </w:tcPr>
+          <w:p>
+            <w:r>
+              <w:rPr>
+                <w:b/>
+                <w:color w:val="FFFFFF"/>
+                <w:sz w:val="19"/>
+              </w:rPr>
+            </w:r>
+            <w:r>
+              <w:rPr>
+                <w:b/>
+                <w:color w:val="FFFFFF"/>
+                <w:sz w:val="19"/>
+              </w:rPr>
+              <w:t>Where</w:t>
+            </w:r>
+          </w:p>
+        </w:tc>
+        <w:tc>
+          <w:tcPr>
+            <w:tcW w:type="dxa" w:w="3324"/>
+            <w:shd w:val="clear" w:color="auto" w:fill="0F2744"/>
+          </w:tcPr>
+          <w:p>
+            <w:r>
+              <w:rPr>
+                <w:b/>
+                <w:color w:val="FFFFFF"/>
+                <w:sz w:val="19"/>
+              </w:rPr>
+            </w:r>
+            <w:r>
+              <w:rPr>
+                <w:b/>
+                <w:color w:val="FFFFFF"/>
+                <w:sz w:val="19"/>
+              </w:rPr>
+              <w:t>Why it now needs calibration</w:t>
+            </w:r>
+          </w:p>
+        </w:tc>
+      </w:tr>
+      <w:tr>
+        <w:tc>
+          <w:tcPr>
+            <w:tcW w:type="dxa" w:w="3324"/>
+          </w:tcPr>
+          <w:p>
+            <w:r>
+              <w:rPr>
+                <w:sz w:val="19"/>
+              </w:rPr>
+            </w:r>
+            <w:r>
+              <w:rPr>
+                <w:rFonts w:ascii="Consolas" w:hAnsi="Consolas"/>
+                <w:sz w:val="19"/>
+              </w:rPr>
+              <w:t>vulnerability</w:t>
+            </w:r>
+            <w:r>
+              <w:rPr>
+                <w:sz w:val="19"/>
+              </w:rPr>
+              <w:t xml:space="preserve"> ← </w:t>
+            </w:r>
+            <w:r>
+              <w:rPr>
+                <w:rFonts w:ascii="Consolas" w:hAnsi="Consolas"/>
+                <w:sz w:val="19"/>
+              </w:rPr>
+              <w:t>_overall_score</w:t>
+            </w:r>
+            <w:r>
+              <w:rPr>
+                <w:sz w:val="19"/>
+              </w:rPr>
+              <w:t xml:space="preserve"> mapping, and the </w:t>
+            </w:r>
+            <w:r>
+              <w:rPr>
+                <w:rFonts w:ascii="Consolas" w:hAnsi="Consolas"/>
+                <w:sz w:val="19"/>
+              </w:rPr>
+              <w:t>0.3</w:t>
+            </w:r>
+            <w:r>
+              <w:rPr>
+                <w:sz w:val="19"/>
+              </w:rPr>
+              <w:t xml:space="preserve"> in </w:t>
+            </w:r>
+            <w:r>
+              <w:rPr>
+                <w:rFonts w:ascii="Consolas" w:hAnsi="Consolas"/>
+                <w:sz w:val="19"/>
+              </w:rPr>
+              <w:t>p_breach = vulnerability × TEF × 0.3</w:t>
+            </w:r>
+          </w:p>
+        </w:tc>
+        <w:tc>
+          <w:tcPr>
+            <w:tcW w:type="dxa" w:w="3324"/>
+          </w:tcPr>
+          <w:p>
+            <w:r>
+              <w:rPr>
+                <w:sz w:val="19"/>
+              </w:rPr>
+            </w:r>
+            <w:r>
+              <w:rPr>
+                <w:rFonts w:ascii="Consolas" w:hAnsi="Consolas"/>
+                <w:sz w:val="19"/>
+              </w:rPr>
+              <w:t>scoring_analytics.py</w:t>
+            </w:r>
+            <w:r>
+              <w:rPr>
+                <w:sz w:val="19"/>
+              </w:rPr>
+              <w:t xml:space="preserve"> (~L2099)</w:t>
+            </w:r>
+          </w:p>
+        </w:tc>
+        <w:tc>
+          <w:tcPr>
+            <w:tcW w:type="dxa" w:w="3324"/>
+          </w:tcPr>
+          <w:p>
+            <w:r>
+              <w:rPr>
+                <w:sz w:val="19"/>
+              </w:rPr>
+            </w:r>
+            <w:r>
+              <w:rPr>
+                <w:sz w:val="19"/>
+              </w:rPr>
+              <w:t xml:space="preserve">coupling is live for the first time; neither the curve nor the </w:t>
+            </w:r>
+            <w:r>
+              <w:rPr>
+                <w:rFonts w:ascii="Consolas" w:hAnsi="Consolas"/>
+                <w:sz w:val="19"/>
+              </w:rPr>
+              <w:t>0.3</w:t>
+            </w:r>
+            <w:r>
+              <w:rPr>
+                <w:sz w:val="19"/>
+              </w:rPr>
+              <w:t xml:space="preserve"> was ever validated against real scores</w:t>
+            </w:r>
+          </w:p>
+        </w:tc>
+      </w:tr>
+      <w:tr>
+        <w:tc>
+          <w:tcPr>
+            <w:tcW w:type="dxa" w:w="3324"/>
+            <w:shd w:val="clear" w:color="auto" w:fill="F2F7FA"/>
+          </w:tcPr>
+          <w:p>
+            <w:r>
+              <w:rPr>
+                <w:sz w:val="19"/>
+              </w:rPr>
+            </w:r>
+            <w:r>
+              <w:rPr>
+                <w:sz w:val="19"/>
+              </w:rPr>
+              <w:t xml:space="preserve">credential → p(breach) contribution (replaces </w:t>
+            </w:r>
+            <w:r>
+              <w:rPr>
+                <w:rFonts w:ascii="Consolas" w:hAnsi="Consolas"/>
+                <w:sz w:val="19"/>
+              </w:rPr>
+              <w:t>dehashed_total × 2</w:t>
+            </w:r>
+            <w:r>
+              <w:rPr>
+                <w:sz w:val="19"/>
+              </w:rPr>
+              <w:t>, ~L669)</w:t>
+            </w:r>
+          </w:p>
+        </w:tc>
+        <w:tc>
+          <w:tcPr>
+            <w:tcW w:type="dxa" w:w="3324"/>
+            <w:shd w:val="clear" w:color="auto" w:fill="F2F7FA"/>
+          </w:tcPr>
+          <w:p>
+            <w:r>
+              <w:rPr>
+                <w:sz w:val="19"/>
+              </w:rPr>
+            </w:r>
+            <w:r>
+              <w:rPr>
+                <w:sz w:val="19"/>
+              </w:rPr>
+              <w:t xml:space="preserve">5L / pre-read </w:t>
+            </w:r>
+            <w:r>
+              <w:rPr>
+                <w:b/>
+                <w:sz w:val="19"/>
+              </w:rPr>
+              <w:t>K1–K7</w:t>
+            </w:r>
+          </w:p>
+        </w:tc>
+        <w:tc>
+          <w:tcPr>
+            <w:tcW w:type="dxa" w:w="3324"/>
+            <w:shd w:val="clear" w:color="auto" w:fill="F2F7FA"/>
+          </w:tcPr>
+          <w:p>
+            <w:r>
+              <w:rPr>
+                <w:sz w:val="19"/>
+              </w:rPr>
+            </w:r>
+            <w:r>
+              <w:rPr>
+                <w:sz w:val="19"/>
+              </w:rPr>
+              <w:t>the confidence-weighted credential class (</w:t>
+            </w:r>
+            <w:r>
+              <w:rPr>
+                <w:rFonts w:ascii="Consolas" w:hAnsi="Consolas"/>
+                <w:sz w:val="19"/>
+              </w:rPr>
+              <w:t>docs/credential_confidence_pbreach_design.md</w:t>
+            </w:r>
+            <w:r>
+              <w:rPr>
+                <w:sz w:val="19"/>
+              </w:rPr>
+              <w:t>)</w:t>
+            </w:r>
+          </w:p>
+        </w:tc>
+      </w:tr>
+      <w:tr>
+        <w:tc>
+          <w:tcPr>
+            <w:tcW w:type="dxa" w:w="3324"/>
+          </w:tcPr>
+          <w:p>
+            <w:r>
+              <w:rPr>
+                <w:sz w:val="19"/>
+              </w:rPr>
+            </w:r>
+            <w:r>
+              <w:rPr>
+                <w:sz w:val="19"/>
+              </w:rPr>
+              <w:t xml:space="preserve">Pareto </w:t>
+            </w:r>
+            <w:r>
+              <w:rPr>
+                <w:b/>
+                <w:sz w:val="19"/>
+              </w:rPr>
+              <w:t>alpha</w:t>
+            </w:r>
+            <w:r>
+              <w:rPr>
+                <w:sz w:val="19"/>
+              </w:rPr>
+              <w:t xml:space="preserve"> + LGB </w:t>
+            </w:r>
+            <w:r>
+              <w:rPr>
+                <w:b/>
+                <w:sz w:val="19"/>
+              </w:rPr>
+              <w:t>mixture weight</w:t>
+            </w:r>
+            <w:r>
+              <w:rPr>
+                <w:sz w:val="19"/>
+              </w:rPr>
+              <w:t xml:space="preserve"> (FIN-9 core)</w:t>
+            </w:r>
+          </w:p>
+        </w:tc>
+        <w:tc>
+          <w:tcPr>
+            <w:tcW w:type="dxa" w:w="3324"/>
+          </w:tcPr>
+          <w:p>
+            <w:r>
+              <w:rPr>
+                <w:sz w:val="19"/>
+              </w:rPr>
+            </w:r>
+            <w:r>
+              <w:rPr>
+                <w:rFonts w:ascii="Consolas" w:hAnsi="Consolas"/>
+                <w:sz w:val="19"/>
+              </w:rPr>
+              <w:t>_calculate_zar</w:t>
+            </w:r>
+          </w:p>
+        </w:tc>
+        <w:tc>
+          <w:tcPr>
+            <w:tcW w:type="dxa" w:w="3324"/>
+          </w:tcPr>
+          <w:p>
+            <w:r>
+              <w:rPr>
+                <w:sz w:val="19"/>
+              </w:rPr>
+            </w:r>
+            <w:r>
+              <w:rPr>
+                <w:sz w:val="19"/>
+              </w:rPr>
+              <w:t>re-anchor to the corrected loss baseline + the MOVEit per-org curve</w:t>
+            </w:r>
+          </w:p>
+        </w:tc>
+      </w:tr>
+      <w:tr>
+        <w:tc>
+          <w:tcPr>
+            <w:tcW w:type="dxa" w:w="3324"/>
+            <w:shd w:val="clear" w:color="auto" w:fill="F2F7FA"/>
+          </w:tcPr>
+          <w:p>
+            <w:r>
+              <w:rPr>
+                <w:sz w:val="19"/>
+              </w:rPr>
+            </w:r>
+            <w:r>
+              <w:rPr>
+                <w:sz w:val="19"/>
+              </w:rPr>
+              <w:t xml:space="preserve">Remediation cap: </w:t>
+            </w:r>
+            <w:r>
+              <w:rPr>
+                <w:rFonts w:ascii="Consolas" w:hAnsi="Consolas"/>
+                <w:sz w:val="19"/>
+              </w:rPr>
+              <w:t>MAX_RSI_REDUCTION_FRACTION=0.15</w:t>
+            </w:r>
+            <w:r>
+              <w:rPr>
+                <w:sz w:val="19"/>
+              </w:rPr>
+              <w:t xml:space="preserve">, </w:t>
+            </w:r>
+            <w:r>
+              <w:rPr>
+                <w:rFonts w:ascii="Consolas" w:hAnsi="Consolas"/>
+                <w:sz w:val="19"/>
+              </w:rPr>
+              <w:t>RSI_RESIDUAL_FLOOR=0.05</w:t>
+            </w:r>
+          </w:p>
+        </w:tc>
+        <w:tc>
+          <w:tcPr>
+            <w:tcW w:type="dxa" w:w="3324"/>
+            <w:shd w:val="clear" w:color="auto" w:fill="F2F7FA"/>
+          </w:tcPr>
+          <w:p>
+            <w:r>
+              <w:rPr>
+                <w:sz w:val="19"/>
+              </w:rPr>
+            </w:r>
+            <w:r>
+              <w:rPr>
+                <w:rFonts w:ascii="Consolas" w:hAnsi="Consolas"/>
+                <w:sz w:val="19"/>
+              </w:rPr>
+              <w:t>scoring_analytics.py</w:t>
+            </w:r>
+            <w:r>
+              <w:rPr>
+                <w:sz w:val="19"/>
+              </w:rPr>
+              <w:t xml:space="preserve"> (Wave 4)</w:t>
+            </w:r>
+          </w:p>
+        </w:tc>
+        <w:tc>
+          <w:tcPr>
+            <w:tcW w:type="dxa" w:w="3324"/>
+            <w:shd w:val="clear" w:color="auto" w:fill="F2F7FA"/>
+          </w:tcPr>
+          <w:p>
+            <w:r>
+              <w:rPr>
+                <w:sz w:val="19"/>
+              </w:rPr>
+            </w:r>
+            <w:r>
+              <w:rPr>
+                <w:sz w:val="19"/>
+              </w:rPr>
+              <w:t>set heuristically in Wave 4; the ~81% modelled loss-cut is now a calibration question, not a bug</w:t>
+            </w:r>
+          </w:p>
+        </w:tc>
+      </w:tr>
+      <w:tr>
+        <w:tc>
+          <w:tcPr>
+            <w:tcW w:type="dxa" w:w="3324"/>
+          </w:tcPr>
+          <w:p>
+            <w:r>
+              <w:rPr>
+                <w:sz w:val="19"/>
+              </w:rPr>
+            </w:r>
+            <w:r>
+              <w:rPr>
+                <w:sz w:val="19"/>
+              </w:rPr>
+              <w:t>TEF industry-targeting multipliers</w:t>
+            </w:r>
+          </w:p>
+        </w:tc>
+        <w:tc>
+          <w:tcPr>
+            <w:tcW w:type="dxa" w:w="3324"/>
+          </w:tcPr>
+          <w:p>
+            <w:r>
+              <w:rPr>
+                <w:sz w:val="19"/>
+              </w:rPr>
+            </w:r>
+            <w:r>
+              <w:rPr>
+                <w:rFonts w:ascii="Consolas" w:hAnsi="Consolas"/>
+                <w:sz w:val="19"/>
+              </w:rPr>
+              <w:t>scoring_analytics.py</w:t>
+            </w:r>
+          </w:p>
+        </w:tc>
+        <w:tc>
+          <w:tcPr>
+            <w:tcW w:type="dxa" w:w="3324"/>
+          </w:tcPr>
+          <w:p>
+            <w:r>
+              <w:rPr>
+                <w:sz w:val="19"/>
+              </w:rPr>
+            </w:r>
+            <w:r>
+              <w:rPr>
+                <w:sz w:val="19"/>
+              </w:rPr>
+              <w:t>how often each industry is targeted</w:t>
+            </w:r>
+          </w:p>
+        </w:tc>
+      </w:tr>
+      <w:tr>
+        <w:tc>
+          <w:tcPr>
+            <w:tcW w:type="dxa" w:w="3324"/>
+            <w:shd w:val="clear" w:color="auto" w:fill="F2F7FA"/>
+          </w:tcPr>
+          <w:p>
+            <w:r>
+              <w:rPr>
+                <w:sz w:val="19"/>
+              </w:rPr>
+            </w:r>
+            <w:r>
+              <w:rPr>
+                <w:sz w:val="19"/>
+              </w:rPr>
+              <w:t xml:space="preserve">HIBP scenario </w:t>
+            </w:r>
+            <w:r>
+              <w:rPr>
+                <w:rFonts w:ascii="Consolas" w:hAnsi="Consolas"/>
+                <w:sz w:val="19"/>
+              </w:rPr>
+              <w:t>p_breach</w:t>
+            </w:r>
+            <w:r>
+              <w:rPr>
+                <w:sz w:val="19"/>
+              </w:rPr>
+              <w:t xml:space="preserve"> step thresholds (0.35 / 0.20 / 0.08)</w:t>
+            </w:r>
+          </w:p>
+        </w:tc>
+        <w:tc>
+          <w:tcPr>
+            <w:tcW w:type="dxa" w:w="3324"/>
+            <w:shd w:val="clear" w:color="auto" w:fill="F2F7FA"/>
+          </w:tcPr>
+          <w:p>
+            <w:r>
+              <w:rPr>
+                <w:sz w:val="19"/>
+              </w:rPr>
+            </w:r>
+            <w:r>
+              <w:rPr>
+                <w:rFonts w:ascii="Consolas" w:hAnsi="Consolas"/>
+                <w:sz w:val="19"/>
+              </w:rPr>
+              <w:t>scoring_analytics.py:1664</w:t>
+            </w:r>
+          </w:p>
+        </w:tc>
+        <w:tc>
+          <w:tcPr>
+            <w:tcW w:type="dxa" w:w="3324"/>
+            <w:shd w:val="clear" w:color="auto" w:fill="F2F7FA"/>
+          </w:tcPr>
+          <w:p>
+            <w:r>
+              <w:rPr>
+                <w:sz w:val="19"/>
+              </w:rPr>
+            </w:r>
+            <w:r>
+              <w:rPr>
+                <w:sz w:val="19"/>
+              </w:rPr>
+              <w:t>heuristic step function</w:t>
+            </w:r>
+          </w:p>
+        </w:tc>
+      </w:tr>
+      <w:tr>
+        <w:tc>
+          <w:tcPr>
+            <w:tcW w:type="dxa" w:w="3324"/>
+          </w:tcPr>
+          <w:p>
+            <w:r>
+              <w:rPr>
+                <w:sz w:val="19"/>
+              </w:rPr>
+            </w:r>
+            <w:r>
+              <w:rPr>
+                <w:rFonts w:ascii="Consolas" w:hAnsi="Consolas"/>
+                <w:sz w:val="19"/>
+              </w:rPr>
+              <w:t>COST_PER_RECORD</w:t>
+            </w:r>
+            <w:r>
+              <w:rPr>
+                <w:sz w:val="19"/>
+              </w:rPr>
+              <w:t xml:space="preserve">, </w:t>
+            </w:r>
+            <w:r>
+              <w:rPr>
+                <w:rFonts w:ascii="Consolas" w:hAnsi="Consolas"/>
+                <w:sz w:val="19"/>
+              </w:rPr>
+              <w:t>REGULATORY_FINE</w:t>
+            </w:r>
+            <w:r>
+              <w:rPr>
+                <w:sz w:val="19"/>
+              </w:rPr>
+              <w:t xml:space="preserve"> tables</w:t>
+            </w:r>
+          </w:p>
+        </w:tc>
+        <w:tc>
+          <w:tcPr>
+            <w:tcW w:type="dxa" w:w="3324"/>
+          </w:tcPr>
+          <w:p>
+            <w:r>
+              <w:rPr>
+                <w:sz w:val="19"/>
+              </w:rPr>
+            </w:r>
+            <w:r>
+              <w:rPr>
+                <w:rFonts w:ascii="Consolas" w:hAnsi="Consolas"/>
+                <w:sz w:val="19"/>
+              </w:rPr>
+              <w:t>scoring_analytics.py</w:t>
+            </w:r>
+          </w:p>
+        </w:tc>
+        <w:tc>
+          <w:tcPr>
+            <w:tcW w:type="dxa" w:w="3324"/>
+          </w:tcPr>
+          <w:p>
+            <w:r>
+              <w:rPr>
+                <w:sz w:val="19"/>
+              </w:rPr>
+            </w:r>
+            <w:r>
+              <w:rPr>
+                <w:sz w:val="19"/>
+              </w:rPr>
+              <w:t>per-industry SA values</w:t>
+            </w:r>
+          </w:p>
+        </w:tc>
+      </w:tr>
+      <w:tr>
+        <w:tc>
+          <w:tcPr>
+            <w:tcW w:type="dxa" w:w="3324"/>
+            <w:shd w:val="clear" w:color="auto" w:fill="F2F7FA"/>
+          </w:tcPr>
+          <w:p>
+            <w:r>
+              <w:rPr>
+                <w:sz w:val="19"/>
+              </w:rPr>
+            </w:r>
+            <w:r>
+              <w:rPr>
+                <w:rFonts w:ascii="Consolas" w:hAnsi="Consolas"/>
+                <w:sz w:val="19"/>
+              </w:rPr>
+              <w:t>K_TAIL = 1.20</w:t>
+            </w:r>
+            <w:r>
+              <w:rPr>
+                <w:sz w:val="19"/>
+              </w:rPr>
+              <w:t xml:space="preserve"> (catastrophe tail widening)</w:t>
+            </w:r>
+          </w:p>
+        </w:tc>
+        <w:tc>
+          <w:tcPr>
+            <w:tcW w:type="dxa" w:w="3324"/>
+            <w:shd w:val="clear" w:color="auto" w:fill="F2F7FA"/>
+          </w:tcPr>
+          <w:p>
+            <w:r>
+              <w:rPr>
+                <w:sz w:val="19"/>
+              </w:rPr>
+            </w:r>
+            <w:r>
+              <w:rPr>
+                <w:rFonts w:ascii="Consolas" w:hAnsi="Consolas"/>
+                <w:sz w:val="19"/>
+              </w:rPr>
+              <w:t>_calculate_zar</w:t>
+            </w:r>
+          </w:p>
+        </w:tc>
+        <w:tc>
+          <w:tcPr>
+            <w:tcW w:type="dxa" w:w="3324"/>
+            <w:shd w:val="clear" w:color="auto" w:fill="F2F7FA"/>
+          </w:tcPr>
+          <w:p>
+            <w:r>
+              <w:rPr>
+                <w:sz w:val="19"/>
+              </w:rPr>
+            </w:r>
+            <w:r>
+              <w:rPr>
+                <w:sz w:val="19"/>
+              </w:rPr>
+              <w:t>heuristic</w:t>
+            </w:r>
+          </w:p>
+        </w:tc>
+      </w:tr>
+    </w:tbl>
+    <w:p/>
+    <w:p>
+      <w:r>
+        <w:rPr>
+          <w:b/>
+        </w:rPr>
+        <w:t>Pre-session action:</w:t>
+      </w:r>
+      <w:r>
+        <w:t xml:space="preserve"> regenerate the reference loss curves on the FIXED code (a clean</w:t>
+      </w:r>
+    </w:p>
+    <w:p>
+      <w:r>
+        <w:t>post-fix scan of takealot + 1–2 references) so the calibration anchors to the corrected</w:t>
+      </w:r>
+    </w:p>
+    <w:p>
+      <w:r>
+        <w:t xml:space="preserve">baseline. </w:t>
+      </w:r>
+      <w:r>
+        <w:rPr>
+          <w:rFonts w:ascii="Consolas" w:hAnsi="Consolas"/>
+          <w:sz w:val="18"/>
+        </w:rPr>
+        <w:t>verify_supply_chain_financial_wiring.py</w:t>
+      </w:r>
+      <w:r>
+        <w:t xml:space="preserve"> confirms wiring but INJECTS scores —</w:t>
+      </w:r>
+    </w:p>
+    <w:p>
+      <w:r>
+        <w:t>use a real fixed-code scan for the magnitudes. (A fixed-code phishield scan is already in</w:t>
+      </w:r>
+    </w:p>
+    <w:p>
+      <w:r>
+        <w:rPr>
+          <w:rFonts w:ascii="Consolas" w:hAnsi="Consolas"/>
+          <w:sz w:val="18"/>
+        </w:rPr>
+        <w:t>test_fixtures/phishield_live.json</w:t>
+      </w:r>
+      <w:r>
+        <w:t>.)</w:t>
+      </w:r>
+    </w:p>
+    <w:p>
+      <w:pPr>
+        <w:spacing w:before="280" w:after="80"/>
+      </w:pPr>
+      <w:r>
+        <w:rPr>
+          <w:b/>
+          <w:color w:val="0F2744"/>
+          <w:sz w:val="28"/>
+        </w:rPr>
         <w:t>7. Documentation / artifacts</w:t>
       </w:r>
     </w:p>

</xml_diff>

<commit_message>
docs: add risk-level band re-fit to the calibration prep/handoff + OUTSTANDING §6b
The Low/Med/High/Crit cut-offs (200/400/600 on the 0-1000 score, scoring_analytics.py:806)
are a fixed even split set against the OLD inflated score distribution. This session's
de-inflation lowered scores (phishield 381->169), so the bands may now mis-bucket (a "High"
org can land in "Medium"). Added as a calibration item: re-fit to the corrected distribution
+ align to the calibrated p(breach) tiers (do it last, after the curve + base rate). Re-rendered
both docx.

Co-Authored-By: Claude Opus 4.7 <noreply@anthropic.com>
</commit_message>
<xml_diff>
--- a/security_scanner/docs/OUTSTANDING.docx
+++ b/security_scanner/docs/OUTSTANDING.docx
@@ -5275,6 +5275,76 @@
           </w:p>
         </w:tc>
       </w:tr>
+      <w:tr>
+        <w:tc>
+          <w:tcPr>
+            <w:tcW w:type="dxa" w:w="3324"/>
+          </w:tcPr>
+          <w:p>
+            <w:r>
+              <w:rPr>
+                <w:sz w:val="19"/>
+              </w:rPr>
+            </w:r>
+            <w:r>
+              <w:rPr>
+                <w:sz w:val="19"/>
+              </w:rPr>
+              <w:t xml:space="preserve">Risk-level bands </w:t>
+            </w:r>
+            <w:r>
+              <w:rPr>
+                <w:rFonts w:ascii="Consolas" w:hAnsi="Consolas"/>
+                <w:sz w:val="19"/>
+              </w:rPr>
+              <w:t>200 / 400 / 600</w:t>
+            </w:r>
+            <w:r>
+              <w:rPr>
+                <w:sz w:val="19"/>
+              </w:rPr>
+              <w:t xml:space="preserve"> (Low/Med/High/Crit on the 0-1000 score)</w:t>
+            </w:r>
+          </w:p>
+        </w:tc>
+        <w:tc>
+          <w:tcPr>
+            <w:tcW w:type="dxa" w:w="3324"/>
+          </w:tcPr>
+          <w:p>
+            <w:r>
+              <w:rPr>
+                <w:sz w:val="19"/>
+              </w:rPr>
+            </w:r>
+            <w:r>
+              <w:rPr>
+                <w:rFonts w:ascii="Consolas" w:hAnsi="Consolas"/>
+                <w:sz w:val="19"/>
+              </w:rPr>
+              <w:t>scoring_analytics.py:806</w:t>
+            </w:r>
+          </w:p>
+        </w:tc>
+        <w:tc>
+          <w:tcPr>
+            <w:tcW w:type="dxa" w:w="3324"/>
+          </w:tcPr>
+          <w:p>
+            <w:r>
+              <w:rPr>
+                <w:sz w:val="19"/>
+              </w:rPr>
+            </w:r>
+            <w:r>
+              <w:rPr>
+                <w:sz w:val="19"/>
+              </w:rPr>
+              <w:t>fixed even split, set against the OLD inflated distribution; de-inflation lowered scores (phishield 381-&gt;169) so they may now mis-bucket — re-fit to the corrected distribution + align to the calibrated p(breach) tiers</w:t>
+            </w:r>
+          </w:p>
+        </w:tc>
+      </w:tr>
     </w:tbl>
     <w:p/>
     <w:p>

</xml_diff>

<commit_message>
Scanner: prune aged-out marketo vendor-breach row (5-yr lookback)
The 2021-06-22 Marketo row exits the 1825d lookback on 2026-06-21; its
age-decayed contribution was ~0.5% (effectively nil). Pruned per the
confirmed-only editorial discipline rather than re-dated - the date field
is the breach date anchoring age-decay, not a maintenance date.

WATCH ITEM recorded in _pruned + OUTSTANDING: alleged Adobe breach
early-April 2026 (UNC6783, ~13M support tickets via compromised BPO;
Marketo Engage plausibly in scope). Add a fresh confirmed row if Adobe
confirms. Wiring gate: 28/28, drift check clean.

Co-Authored-By: Claude Fable 5 <noreply@anthropic.com>
</commit_message>
<xml_diff>
--- a/security_scanner/docs/OUTSTANDING.docx
+++ b/security_scanner/docs/OUTSTANDING.docx
@@ -835,7 +835,7 @@
                 <w:b/>
                 <w:sz w:val="19"/>
               </w:rPr>
-              <w:t>`vendor_breaches.json` `marketo` row</w:t>
+              <w:t>`vendor_breaches.json` — Adobe/Marketo watch item</w:t>
             </w:r>
           </w:p>
         </w:tc>
@@ -854,7 +854,20 @@
               <w:rPr>
                 <w:sz w:val="19"/>
               </w:rPr>
-              <w:t>Exits the 5-yr lookback ~2026-06-21</w:t>
+              <w:t xml:space="preserve">2021 </w:t>
+            </w:r>
+            <w:r>
+              <w:rPr>
+                <w:rFonts w:ascii="Consolas" w:hAnsi="Consolas"/>
+                <w:sz w:val="19"/>
+              </w:rPr>
+              <w:t>marketo</w:t>
+            </w:r>
+            <w:r>
+              <w:rPr>
+                <w:sz w:val="19"/>
+              </w:rPr>
+              <w:t xml:space="preserve"> row PRUNED 2026-06-11 (aged out of the 5-yr lookback; decayed contribution was ~0.5%).</w:t>
             </w:r>
           </w:p>
         </w:tc>
@@ -892,7 +905,33 @@
               <w:rPr>
                 <w:sz w:val="19"/>
               </w:rPr>
-              <w:t>Refresh or prune deliberately; the wiring gate warns until then.</w:t>
+              <w:t xml:space="preserve">WATCH: alleged Adobe breach early-April 2026 (UNC6783, ~13M support tickets via compromised BPO; Marketo Engage plausibly in scope). Confirmed-only DB discipline — add a fresh row with the 2026 date if/when Adobe confirms. Details in </w:t>
+            </w:r>
+            <w:r>
+              <w:rPr>
+                <w:rFonts w:ascii="Consolas" w:hAnsi="Consolas"/>
+                <w:sz w:val="19"/>
+              </w:rPr>
+              <w:t>vendor_breaches.json</w:t>
+            </w:r>
+            <w:r>
+              <w:rPr>
+                <w:sz w:val="19"/>
+              </w:rPr>
+              <w:t xml:space="preserve"> </w:t>
+            </w:r>
+            <w:r>
+              <w:rPr>
+                <w:rFonts w:ascii="Consolas" w:hAnsi="Consolas"/>
+                <w:sz w:val="19"/>
+              </w:rPr>
+              <w:t>_pruned</w:t>
+            </w:r>
+            <w:r>
+              <w:rPr>
+                <w:sz w:val="19"/>
+              </w:rPr>
+              <w:t>.</w:t>
             </w:r>
           </w:p>
         </w:tc>

</xml_diff>